<commit_message>
Add theme-adaptive SVG favicons (dark/light/galaxy), fix contact form fallback (mailto:), add temp file to .gitignore
</commit_message>
<xml_diff>
--- a/Suraj_Dobale_Resume.docx
+++ b/Suraj_Dobale_Resume.docx
@@ -110,7 +110,27 @@
             <w:szCs w:val="19"/>
             <w:u w:val="single"/>
           </w:rPr>
-          <w:t>github.com/SURYaDob</w:t>
+          <w:t>GitH</w:t>
+        </w:r>
+        <w:r>
+          <w:rPr>
+            <w:rFonts w:asciiTheme="minorHAnsi" w:hAnsiTheme="minorHAnsi" w:cstheme="minorHAnsi"/>
+            <w:color w:val="1A5276"/>
+            <w:sz w:val="19"/>
+            <w:szCs w:val="19"/>
+            <w:u w:val="single"/>
+          </w:rPr>
+          <w:t>u</w:t>
+        </w:r>
+        <w:r>
+          <w:rPr>
+            <w:rFonts w:asciiTheme="minorHAnsi" w:hAnsiTheme="minorHAnsi" w:cstheme="minorHAnsi"/>
+            <w:color w:val="1A5276"/>
+            <w:sz w:val="19"/>
+            <w:szCs w:val="19"/>
+            <w:u w:val="single"/>
+          </w:rPr>
+          <w:t>b</w:t>
         </w:r>
       </w:hyperlink>
     </w:p>
@@ -528,6 +548,46 @@
     </w:p>
     <w:p>
       <w:pPr>
+        <w:spacing w:before="30" w:after="30"/>
+        <w:rPr>
+          <w:rFonts w:asciiTheme="minorHAnsi" w:hAnsiTheme="minorHAnsi" w:cstheme="minorHAnsi"/>
+        </w:rPr>
+      </w:pPr>
+      <w:r>
+        <w:rPr>
+          <w:rFonts w:asciiTheme="minorHAnsi" w:hAnsiTheme="minorHAnsi" w:cstheme="minorHAnsi"/>
+          <w:b/>
+          <w:bCs/>
+          <w:sz w:val="19"/>
+          <w:szCs w:val="19"/>
+        </w:rPr>
+        <w:t xml:space="preserve"> G</w:t>
+      </w:r>
+      <w:r>
+        <w:rPr>
+          <w:rFonts w:asciiTheme="minorHAnsi" w:hAnsiTheme="minorHAnsi" w:cstheme="minorHAnsi"/>
+          <w:b/>
+          <w:bCs/>
+          <w:sz w:val="19"/>
+          <w:szCs w:val="19"/>
+        </w:rPr>
+        <w:t xml:space="preserve">itHub: </w:t>
+      </w:r>
+      <w:hyperlink r:id="rId9" w:history="1">
+        <w:r>
+          <w:rPr>
+            <w:rFonts w:asciiTheme="minorHAnsi" w:hAnsiTheme="minorHAnsi" w:cstheme="minorHAnsi"/>
+            <w:color w:val="1A5276"/>
+            <w:sz w:val="19"/>
+            <w:szCs w:val="19"/>
+            <w:u w:val="single"/>
+          </w:rPr>
+          <w:t>github.com/SURYaDob/enterprise</w:t>
+        </w:r>
+      </w:hyperlink>
+    </w:p>
+    <w:p>
+      <w:pPr>
         <w:pStyle w:val="ListParagraph"/>
         <w:numPr>
           <w:ilvl w:val="0"/>
@@ -635,6 +695,46 @@
     </w:p>
     <w:p>
       <w:pPr>
+        <w:spacing w:before="30" w:after="30"/>
+        <w:rPr>
+          <w:rFonts w:asciiTheme="minorHAnsi" w:hAnsiTheme="minorHAnsi" w:cstheme="minorHAnsi"/>
+        </w:rPr>
+      </w:pPr>
+      <w:r>
+        <w:rPr>
+          <w:rFonts w:asciiTheme="minorHAnsi" w:hAnsiTheme="minorHAnsi" w:cstheme="minorHAnsi"/>
+          <w:b/>
+          <w:bCs/>
+          <w:sz w:val="19"/>
+          <w:szCs w:val="19"/>
+        </w:rPr>
+        <w:t xml:space="preserve"> G</w:t>
+      </w:r>
+      <w:r>
+        <w:rPr>
+          <w:rFonts w:asciiTheme="minorHAnsi" w:hAnsiTheme="minorHAnsi" w:cstheme="minorHAnsi"/>
+          <w:b/>
+          <w:bCs/>
+          <w:sz w:val="19"/>
+          <w:szCs w:val="19"/>
+        </w:rPr>
+        <w:t xml:space="preserve">itHub: </w:t>
+      </w:r>
+      <w:hyperlink r:id="rId10" w:history="1">
+        <w:r>
+          <w:rPr>
+            <w:rFonts w:asciiTheme="minorHAnsi" w:hAnsiTheme="minorHAnsi" w:cstheme="minorHAnsi"/>
+            <w:color w:val="1A5276"/>
+            <w:sz w:val="19"/>
+            <w:szCs w:val="19"/>
+            <w:u w:val="single"/>
+          </w:rPr>
+          <w:t>github.com/SURYaDob/laundry-system</w:t>
+        </w:r>
+      </w:hyperlink>
+    </w:p>
+    <w:p>
+      <w:pPr>
         <w:pStyle w:val="ListParagraph"/>
         <w:numPr>
           <w:ilvl w:val="0"/>
@@ -773,19 +873,9 @@
           <w:sz w:val="19"/>
           <w:szCs w:val="19"/>
         </w:rPr>
-        <w:t>GitHub:</w:t>
-      </w:r>
-      <w:r>
-        <w:rPr>
-          <w:rFonts w:asciiTheme="minorHAnsi" w:hAnsiTheme="minorHAnsi" w:cstheme="minorHAnsi"/>
-          <w:b/>
-          <w:bCs/>
-          <w:sz w:val="19"/>
-          <w:szCs w:val="19"/>
-        </w:rPr>
-        <w:t xml:space="preserve"> </w:t>
-      </w:r>
-      <w:hyperlink r:id="rId9" w:history="1">
+        <w:t xml:space="preserve">GitHub: </w:t>
+      </w:r>
+      <w:hyperlink r:id="rId11" w:history="1">
         <w:r>
           <w:rPr>
             <w:rStyle w:val="Hyperlink"/>
@@ -851,6 +941,7 @@
         <w:rPr>
           <w:rFonts w:asciiTheme="minorHAnsi" w:hAnsiTheme="minorHAnsi" w:cstheme="minorHAnsi"/>
         </w:rPr>
+        <w:lastRenderedPageBreak/>
         <w:t>Designed a 3-table MySQL schema with foreign key constraints and implemented Spring Data JPA repositories with custom JPQL queries for attendance percentage and average marks reporting.</w:t>
       </w:r>
     </w:p>
@@ -873,7 +964,6 @@
           <w:sz w:val="24"/>
           <w:szCs w:val="24"/>
         </w:rPr>
-        <w:lastRenderedPageBreak/>
         <w:t>EDUCATION</w:t>
       </w:r>
     </w:p>
@@ -1895,6 +1985,7 @@
   <w:style w:type="character" w:default="1" w:styleId="DefaultParagraphFont">
     <w:name w:val="Default Paragraph Font"/>
     <w:uiPriority w:val="1"/>
+    <w:semiHidden/>
     <w:unhideWhenUsed/>
   </w:style>
   <w:style w:type="table" w:default="1" w:styleId="TableNormal">

</xml_diff>